<commit_message>
Popraw nazwy zmiennych w szablonach file1/file2/file3 (pl→en)
Co-Authored-By: Claude Sonnet 4.6 <noreply@anthropic.com>
</commit_message>
<xml_diff>
--- a/backend/documents/templates/file1.docx
+++ b/backend/documents/templates/file1.docx
@@ -83,13 +83,14 @@
         <w:t xml:space="preserve">       Ełk, dn. </w:t>
       </w:r>
       <w:r>
-        <w:t xml:space="preserve">{{ </w:t>
-      </w:r>
-      <w:proofErr w:type="spellStart"/>
-      <w:r>
-        <w:t>data_utworzenia</w:t>
-      </w:r>
-      <w:proofErr w:type="spellEnd"/>
+        <w:t>{{</w:t>
+      </w:r>
+      <w:r>
+        <w:t xml:space="preserve"> </w:t>
+      </w:r>
+      <w:r>
+        <w:t>created_at.</w:t>
+      </w:r>
       <w:r>
         <w:t xml:space="preserve"> }}</w:t>
       </w:r>
@@ -267,15 +268,7 @@
         <w:jc w:val="both"/>
       </w:pPr>
       <w:r>
-        <w:t xml:space="preserve"> Pozostałe elementy programu </w:t>
-      </w:r>
-      <w:proofErr w:type="spellStart"/>
-      <w:r>
-        <w:t>tj</w:t>
-      </w:r>
-      <w:proofErr w:type="spellEnd"/>
-      <w:r>
-        <w:t xml:space="preserve">: </w:t>
+        <w:t xml:space="preserve"> Pozostałe elementy programu tj: </w:t>
       </w:r>
     </w:p>
     <w:p>

</xml_diff>